<commit_message>
feat: align default report template and styles
</commit_message>
<xml_diff>
--- a/templates/template.sample.docx
+++ b/templates/template.sample.docx
@@ -4,19 +4,15 @@
   <w:body>
     <w:p>
       <w:pPr>
-        <w:jc w:val="center"/>
+        <w:pStyle w:val="题目"/>
       </w:pPr>
       <w:r>
-        <w:rPr>
-          <w:b/>
-          <w:sz w:val="36"/>
-        </w:rPr>
-        <w:t>Project Report Template</w:t>
+        <w:t>报告题目 / Report Title</w:t>
       </w:r>
     </w:p>
     <w:p>
       <w:pPr>
-        <w:spacing w:after="120"/>
+        <w:pStyle w:val="正文"/>
       </w:pPr>
       <w:r>
         <w:t>姓 名：</w:t>
@@ -24,7 +20,7 @@
     </w:p>
     <w:p>
       <w:pPr>
-        <w:spacing w:after="120"/>
+        <w:pStyle w:val="正文"/>
       </w:pPr>
       <w:r>
         <w:t>学 号：</w:t>
@@ -32,59 +28,55 @@
     </w:p>
     <w:p>
       <w:pPr>
-        <w:spacing w:after="120"/>
+        <w:pStyle w:val="正文"/>
       </w:pPr>
       <w:r>
         <w:t>完成日期：</w:t>
       </w:r>
     </w:p>
     <w:p>
+      <w:pPr>
+        <w:pStyle w:val="标题2"/>
+      </w:pPr>
       <w:r>
-        <w:br w:type="page"/>
+        <w:t>一、正文内容</w:t>
       </w:r>
     </w:p>
     <w:p>
       <w:pPr>
-        <w:pStyle w:val="Heading1"/>
+        <w:pStyle w:val="标题3"/>
       </w:pPr>
       <w:r>
-        <w:t>1 Overview</w:t>
-      </w:r>
-    </w:p>
-    <w:p>
-      <w:r>
-        <w:t>[Replace this section with project-specific body content.]</w:t>
+        <w:t>1.1 小节示例</w:t>
       </w:r>
     </w:p>
     <w:p>
       <w:pPr>
-        <w:pStyle w:val="Heading1"/>
+        <w:pStyle w:val="正文"/>
       </w:pPr>
       <w:r>
-        <w:t>2 Details</w:t>
-      </w:r>
-    </w:p>
-    <w:p>
-      <w:r>
-        <w:t>[Add figures, tables, analysis, and references here.]</w:t>
+        <w:t>[正文内容将在此处由 Markdown 替换]</w:t>
       </w:r>
     </w:p>
     <w:p>
       <w:pPr>
-        <w:pStyle w:val="Heading1"/>
+        <w:pStyle w:val="标题2"/>
       </w:pPr>
       <w:r>
-        <w:t>3 References</w:t>
+        <w:t>二、参考文献</w:t>
       </w:r>
     </w:p>
     <w:p>
+      <w:pPr>
+        <w:pStyle w:val="参考文献"/>
+      </w:pPr>
       <w:r>
-        <w:t>[Reference placeholder]</w:t>
+        <w:t>[1] 参考文献条目示例</w:t>
       </w:r>
     </w:p>
     <w:sectPr>
-      <w:pgSz w:w="12240" w:h="15840"/>
-      <w:pgMar w:top="1440" w:right="1800" w:bottom="1440" w:left="1800" w:header="720" w:footer="720" w:gutter="0"/>
+      <w:pgSz w:w="11906" w:h="16838"/>
+      <w:pgMar w:top="1440" w:right="1797" w:bottom="1440" w:left="1797" w:header="720" w:footer="720" w:gutter="0"/>
       <w:cols w:space="720"/>
       <w:docGrid w:linePitch="360"/>
     </w:sectPr>
@@ -455,6 +447,16 @@
     <w:name w:val="Normal"/>
     <w:qFormat/>
     <w:rsid w:val="00FC693F"/>
+    <w:pPr>
+      <w:spacing w:line="360" w:lineRule="auto" w:before="0" w:after="0"/>
+      <w:ind w:firstLine="560"/>
+      <w:jc w:val="both"/>
+    </w:pPr>
+    <w:rPr>
+      <w:rFonts w:ascii="Times New Roman" w:hAnsi="Times New Roman" w:eastAsia="仿宋"/>
+      <w:b w:val="0"/>
+      <w:sz w:val="28"/>
+    </w:rPr>
   </w:style>
   <w:style w:type="paragraph" w:styleId="Header">
     <w:name w:val="header"/>
@@ -12137,6 +12139,130 @@
         <w:shd w:val="clear" w:color="auto" w:fill="FBCAA2" w:themeFill="accent6" w:themeFillTint="7F"/>
       </w:tcPr>
     </w:tblStylePr>
+  </w:style>
+  <w:style w:type="paragraph" w:customStyle="1" w:styleId="题目">
+    <w:name w:val="题目"/>
+    <w:basedOn w:val="Normal"/>
+    <w:pPr>
+      <w:spacing w:after="240" w:before="0" w:line="360" w:lineRule="auto"/>
+      <w:ind w:firstLine="0"/>
+      <w:jc w:val="center"/>
+    </w:pPr>
+    <w:rPr>
+      <w:rFonts w:ascii="Times New Roman" w:hAnsi="Times New Roman" w:eastAsia="宋体"/>
+      <w:b w:val="0"/>
+      <w:sz w:val="44"/>
+    </w:rPr>
+  </w:style>
+  <w:style w:type="paragraph" w:customStyle="1" w:styleId="标题2">
+    <w:name w:val="标题2"/>
+    <w:basedOn w:val="Normal"/>
+    <w:pPr>
+      <w:spacing w:before="240" w:after="120" w:line="360" w:lineRule="auto"/>
+      <w:ind w:firstLine="0"/>
+      <w:jc w:val="left"/>
+    </w:pPr>
+    <w:rPr>
+      <w:rFonts w:ascii="Times New Roman" w:hAnsi="Times New Roman" w:eastAsia="宋体"/>
+      <w:b/>
+      <w:sz w:val="32"/>
+    </w:rPr>
+  </w:style>
+  <w:style w:type="paragraph" w:customStyle="1" w:styleId="标题3">
+    <w:name w:val="标题3"/>
+    <w:basedOn w:val="Normal"/>
+    <w:pPr>
+      <w:spacing w:before="120" w:after="60" w:line="360" w:lineRule="auto"/>
+      <w:ind w:firstLine="0"/>
+      <w:jc w:val="left"/>
+    </w:pPr>
+    <w:rPr>
+      <w:rFonts w:ascii="Times New Roman" w:hAnsi="Times New Roman" w:eastAsia="宋体"/>
+      <w:b/>
+      <w:sz w:val="30"/>
+    </w:rPr>
+  </w:style>
+  <w:style w:type="paragraph" w:customStyle="1" w:styleId="正文">
+    <w:name w:val="正文"/>
+    <w:basedOn w:val="Normal"/>
+    <w:pPr>
+      <w:spacing w:line="360" w:lineRule="auto" w:before="0" w:after="0"/>
+      <w:ind w:firstLine="420"/>
+      <w:jc w:val="both"/>
+    </w:pPr>
+    <w:rPr>
+      <w:rFonts w:ascii="Times New Roman" w:hAnsi="Times New Roman" w:eastAsia="仿宋"/>
+      <w:b w:val="0"/>
+      <w:sz w:val="28"/>
+    </w:rPr>
+  </w:style>
+  <w:style w:type="paragraph" w:customStyle="1" w:styleId="图题">
+    <w:name w:val="图题"/>
+    <w:basedOn w:val="Normal"/>
+    <w:pPr>
+      <w:spacing w:before="120" w:after="60" w:line="240" w:lineRule="auto"/>
+      <w:ind w:firstLine="0"/>
+      <w:jc w:val="center"/>
+    </w:pPr>
+    <w:rPr>
+      <w:rFonts w:ascii="Times New Roman" w:hAnsi="Times New Roman" w:eastAsia="宋体"/>
+      <w:b w:val="0"/>
+      <w:sz w:val="21"/>
+    </w:rPr>
+  </w:style>
+  <w:style w:type="paragraph" w:customStyle="1" w:styleId="表题">
+    <w:name w:val="表题"/>
+    <w:basedOn w:val="Normal"/>
+    <w:pPr>
+      <w:spacing w:before="60" w:after="60" w:line="240" w:lineRule="auto"/>
+      <w:ind w:firstLine="0"/>
+      <w:jc w:val="center"/>
+    </w:pPr>
+    <w:rPr>
+      <w:rFonts w:ascii="Times New Roman" w:hAnsi="Times New Roman" w:eastAsia="宋体"/>
+      <w:b w:val="0"/>
+      <w:sz w:val="21"/>
+    </w:rPr>
+  </w:style>
+  <w:style w:type="paragraph" w:customStyle="1" w:styleId="参考文献">
+    <w:name w:val="参考文献"/>
+    <w:basedOn w:val="Normal"/>
+    <w:pPr>
+      <w:spacing w:line="360" w:lineRule="auto" w:before="0" w:after="0"/>
+      <w:ind w:left="0" w:hanging="420"/>
+      <w:jc w:val="both"/>
+    </w:pPr>
+    <w:rPr>
+      <w:rFonts w:ascii="Times New Roman" w:hAnsi="Times New Roman" w:eastAsia="仿宋"/>
+      <w:b w:val="0"/>
+      <w:sz w:val="24"/>
+    </w:rPr>
+  </w:style>
+  <w:style w:type="paragraph" w:customStyle="1" w:styleId="代码块">
+    <w:name w:val="代码块"/>
+    <w:pPr>
+      <w:spacing w:before="0" w:after="0" w:line="240" w:lineRule="auto"/>
+      <w:ind w:firstLine="0"/>
+      <w:jc w:val="left"/>
+    </w:pPr>
+    <w:rPr>
+      <w:rFonts w:ascii="Consolas" w:hAnsi="Consolas" w:eastAsia="Consolas"/>
+      <w:b w:val="0"/>
+      <w:sz w:val="21"/>
+    </w:rPr>
+  </w:style>
+  <w:style w:type="paragraph" w:customStyle="1" w:styleId="标题4">
+    <w:name w:val="标题4"/>
+    <w:pPr>
+      <w:spacing w:before="80" w:after="40" w:line="360" w:lineRule="auto"/>
+      <w:ind w:firstLine="0"/>
+      <w:jc w:val="left"/>
+    </w:pPr>
+    <w:rPr>
+      <w:rFonts w:ascii="Times New Roman" w:hAnsi="Times New Roman" w:eastAsia="宋体"/>
+      <w:b/>
+      <w:sz w:val="28"/>
+    </w:rPr>
   </w:style>
 </w:styles>
 </file>

</xml_diff>